<commit_message>
Teklif PDF olarak da uretiliyor; 7/24 asil teklif haline getirildi
Mesai disi paketi ayri bir sutun olarak 7/24 ile esit agirlikta
duruyordu; bu, istemedikleri ucuz secenegi varsayilan haline getirme
riski tasiyordu. Yeniden duzenlendi: 7/24 asil teklif, mesai disi
"kucuk baslamak isterseniz" alt basligi altinda ikincil secenek,
aralarinda ek kurulum ucreti olmadan gecis yapilabildigi belirtiliyor.

md-pdf.py: markdown -> A4 baski HTML. PDF headless Chromium ile
basiliyor (render.sh ile ayni yol, dis servis yok). Bos son sayfa
yapan tekrar eden imza satirlari kaldirildi, satir araligi
sikistirildi; belge 4 sayfa.

Co-Authored-By: Claude Opus 5 <noreply@anthropic.com>
Claude-Session: https://claude.ai/code/session_0149teNF1LWQwdFzSiSxHK2B
</commit_message>
<xml_diff>
--- a/deniz-dent/Deniz-Dent-Teklif-Fiyat.docx
+++ b/deniz-dent/Deniz-Dent-Teklif-Fiyat.docx
@@ -168,7 +168,7 @@
           <w:sz w:val="30"/>
           <w:szCs w:val="30"/>
         </w:rPr>
-        <w:t xml:space="preserve">2. İki seçenek</w:t>
+        <w:t xml:space="preserve">2. Teklifimiz: 7/24 tam kapsam</w:t>
       </w:r>
     </w:p>
     <w:p>
@@ -180,7 +180,7 @@
           <w:sz w:val="22"/>
           <w:szCs w:val="22"/>
         </w:rPr>
-        <w:t xml:space="preserve">İhtiyacınıza göre iki kapsam sunuyoruz. İstediğiniz zaman birinden diğerine geçebilirsiniz.</w:t>
+        <w:t xml:space="preserve">Kliniğinizin talebi doğrultusunda hazırladığımız asıl teklif budur.</w:t>
       </w:r>
     </w:p>
     <w:tbl>
@@ -196,14 +196,13 @@
         </w:tblBorders>
       </w:tblPr>
       <w:tblGrid>
-        <w:gridCol w:w="3120"/>
-        <w:gridCol w:w="3120"/>
-        <w:gridCol w:w="3120"/>
+        <w:gridCol w:w="4680"/>
+        <w:gridCol w:w="4680"/>
       </w:tblGrid>
       <w:tr>
         <w:tc>
           <w:tcPr>
-            <w:tcW w:type="dxa" w:w="3120"/>
+            <w:tcW w:type="dxa" w:w="4680"/>
             <w:shd w:fill="0F766E" w:val="clear"/>
             <w:tcMar>
               <w:top w:type="dxa" w:w="80"/>
@@ -227,7 +226,7 @@
         </w:tc>
         <w:tc>
           <w:tcPr>
-            <w:tcW w:type="dxa" w:w="3120"/>
+            <w:tcW w:type="dxa" w:w="4680"/>
             <w:shd w:fill="0F766E" w:val="clear"/>
             <w:tcMar>
               <w:top w:type="dxa" w:w="80"/>
@@ -245,31 +244,7 @@
                 <w:sz w:val="20"/>
                 <w:szCs w:val="20"/>
               </w:rPr>
-              <w:t xml:space="preserve">A — 7/24 Tam Kapsam</w:t>
-            </w:r>
-          </w:p>
-        </w:tc>
-        <w:tc>
-          <w:tcPr>
-            <w:tcW w:type="dxa" w:w="3120"/>
-            <w:shd w:fill="0F766E" w:val="clear"/>
-            <w:tcMar>
-              <w:top w:type="dxa" w:w="80"/>
-              <w:left w:type="dxa" w:w="120"/>
-              <w:bottom w:type="dxa" w:w="80"/>
-              <w:right w:type="dxa" w:w="120"/>
-            </w:tcMar>
-          </w:tcPr>
-          <w:p>
-            <w:r>
-              <w:rPr>
-                <w:b/>
-                <w:bCs/>
-                <w:color w:val="FFFFFF"/>
-                <w:sz w:val="20"/>
-                <w:szCs w:val="20"/>
-              </w:rPr>
-              <w:t xml:space="preserve">B — Mesai Dışı ve Hafta Sonu</w:t>
+              <w:t xml:space="preserve"/>
             </w:r>
           </w:p>
         </w:tc>
@@ -277,7 +252,7 @@
       <w:tr>
         <w:tc>
           <w:tcPr>
-            <w:tcW w:type="dxa" w:w="3120"/>
+            <w:tcW w:type="dxa" w:w="4680"/>
             <w:shd w:fill="FFFFFF" w:val="clear"/>
             <w:tcMar>
               <w:top w:type="dxa" w:w="80"/>
@@ -301,7 +276,7 @@
         </w:tc>
         <w:tc>
           <w:tcPr>
-            <w:tcW w:type="dxa" w:w="3120"/>
+            <w:tcW w:type="dxa" w:w="4680"/>
             <w:shd w:fill="FFFFFF" w:val="clear"/>
             <w:tcMar>
               <w:top w:type="dxa" w:w="80"/>
@@ -319,31 +294,7 @@
                 <w:sz w:val="20"/>
                 <w:szCs w:val="20"/>
               </w:rPr>
-              <w:t xml:space="preserve">Her an, 24 saat</w:t>
-            </w:r>
-          </w:p>
-        </w:tc>
-        <w:tc>
-          <w:tcPr>
-            <w:tcW w:type="dxa" w:w="3120"/>
-            <w:shd w:fill="FFFFFF" w:val="clear"/>
-            <w:tcMar>
-              <w:top w:type="dxa" w:w="80"/>
-              <w:left w:type="dxa" w:w="120"/>
-              <w:bottom w:type="dxa" w:w="80"/>
-              <w:right w:type="dxa" w:w="120"/>
-            </w:tcMar>
-          </w:tcPr>
-          <w:p>
-            <w:r>
-              <w:rPr>
-                <w:b w:val="false"/>
-                <w:bCs w:val="false"/>
-                <w:color w:val="1F2937"/>
-                <w:sz w:val="20"/>
-                <w:szCs w:val="20"/>
-              </w:rPr>
-              <w:t xml:space="preserve">Mesai bitince, hafta sonu, tatil</w:t>
+              <w:t xml:space="preserve">Her an — 24 saat, hafta sonu ve tatil dahil</w:t>
             </w:r>
           </w:p>
         </w:tc>
@@ -351,81 +302,7 @@
       <w:tr>
         <w:tc>
           <w:tcPr>
-            <w:tcW w:type="dxa" w:w="3120"/>
-            <w:shd w:fill="FFFFFF" w:val="clear"/>
-            <w:tcMar>
-              <w:top w:type="dxa" w:w="80"/>
-              <w:left w:type="dxa" w:w="120"/>
-              <w:bottom w:type="dxa" w:w="80"/>
-              <w:right w:type="dxa" w:w="120"/>
-            </w:tcMar>
-          </w:tcPr>
-          <w:p>
-            <w:r>
-              <w:rPr>
-                <w:b w:val="false"/>
-                <w:bCs w:val="false"/>
-                <w:color w:val="1F2937"/>
-                <w:sz w:val="20"/>
-                <w:szCs w:val="20"/>
-              </w:rPr>
-              <w:t xml:space="preserve">Gündüz çağrıları</w:t>
-            </w:r>
-          </w:p>
-        </w:tc>
-        <w:tc>
-          <w:tcPr>
-            <w:tcW w:type="dxa" w:w="3120"/>
-            <w:shd w:fill="FFFFFF" w:val="clear"/>
-            <w:tcMar>
-              <w:top w:type="dxa" w:w="80"/>
-              <w:left w:type="dxa" w:w="120"/>
-              <w:bottom w:type="dxa" w:w="80"/>
-              <w:right w:type="dxa" w:w="120"/>
-            </w:tcMar>
-          </w:tcPr>
-          <w:p>
-            <w:r>
-              <w:rPr>
-                <w:b w:val="false"/>
-                <w:bCs w:val="false"/>
-                <w:color w:val="1F2937"/>
-                <w:sz w:val="20"/>
-                <w:szCs w:val="20"/>
-              </w:rPr>
-              <w:t xml:space="preserve">Asistan karşılar</w:t>
-            </w:r>
-          </w:p>
-        </w:tc>
-        <w:tc>
-          <w:tcPr>
-            <w:tcW w:type="dxa" w:w="3120"/>
-            <w:shd w:fill="FFFFFF" w:val="clear"/>
-            <w:tcMar>
-              <w:top w:type="dxa" w:w="80"/>
-              <w:left w:type="dxa" w:w="120"/>
-              <w:bottom w:type="dxa" w:w="80"/>
-              <w:right w:type="dxa" w:w="120"/>
-            </w:tcMar>
-          </w:tcPr>
-          <w:p>
-            <w:r>
-              <w:rPr>
-                <w:b w:val="false"/>
-                <w:bCs w:val="false"/>
-                <w:color w:val="1F2937"/>
-                <w:sz w:val="20"/>
-                <w:szCs w:val="20"/>
-              </w:rPr>
-              <w:t xml:space="preserve">Resepsiyonunuz karşılar</w:t>
-            </w:r>
-          </w:p>
-        </w:tc>
-      </w:tr>
-      <w:tr>
-        <w:tc>
-          <w:tcPr>
-            <w:tcW w:type="dxa" w:w="3120"/>
+            <w:tcW w:type="dxa" w:w="4680"/>
             <w:shd w:fill="FFFFFF" w:val="clear"/>
             <w:tcMar>
               <w:top w:type="dxa" w:w="80"/>
@@ -449,7 +326,7 @@
         </w:tc>
         <w:tc>
           <w:tcPr>
-            <w:tcW w:type="dxa" w:w="3120"/>
+            <w:tcW w:type="dxa" w:w="4680"/>
             <w:shd w:fill="FFFFFF" w:val="clear"/>
             <w:tcMar>
               <w:top w:type="dxa" w:w="80"/>
@@ -471,9 +348,327 @@
             </w:r>
           </w:p>
         </w:tc>
+      </w:tr>
+      <w:tr>
         <w:tc>
           <w:tcPr>
-            <w:tcW w:type="dxa" w:w="3120"/>
+            <w:tcW w:type="dxa" w:w="4680"/>
+            <w:shd w:fill="FFFFFF" w:val="clear"/>
+            <w:tcMar>
+              <w:top w:type="dxa" w:w="80"/>
+              <w:left w:type="dxa" w:w="120"/>
+              <w:bottom w:type="dxa" w:w="80"/>
+              <w:right w:type="dxa" w:w="120"/>
+            </w:tcMar>
+          </w:tcPr>
+          <w:p>
+            <w:r>
+              <w:rPr>
+                <w:b w:val="false"/>
+                <w:bCs w:val="false"/>
+                <w:color w:val="1F2937"/>
+                <w:sz w:val="20"/>
+                <w:szCs w:val="20"/>
+              </w:rPr>
+              <w:t xml:space="preserve">Pakete dahil görüşme süresi</w:t>
+            </w:r>
+          </w:p>
+        </w:tc>
+        <w:tc>
+          <w:tcPr>
+            <w:tcW w:type="dxa" w:w="4680"/>
+            <w:shd w:fill="FFFFFF" w:val="clear"/>
+            <w:tcMar>
+              <w:top w:type="dxa" w:w="80"/>
+              <w:left w:type="dxa" w:w="120"/>
+              <w:bottom w:type="dxa" w:w="80"/>
+              <w:right w:type="dxa" w:w="120"/>
+            </w:tcMar>
+          </w:tcPr>
+          <w:p>
+            <w:r>
+              <w:rPr>
+                <w:b w:val="false"/>
+                <w:bCs w:val="false"/>
+                <w:color w:val="1F2937"/>
+                <w:sz w:val="20"/>
+                <w:szCs w:val="20"/>
+              </w:rPr>
+              <w:t xml:space="preserve">7.500 dakika</w:t>
+            </w:r>
+          </w:p>
+        </w:tc>
+      </w:tr>
+      <w:tr>
+        <w:tc>
+          <w:tcPr>
+            <w:tcW w:type="dxa" w:w="4680"/>
+            <w:shd w:fill="FFFFFF" w:val="clear"/>
+            <w:tcMar>
+              <w:top w:type="dxa" w:w="80"/>
+              <w:left w:type="dxa" w:w="120"/>
+              <w:bottom w:type="dxa" w:w="80"/>
+              <w:right w:type="dxa" w:w="120"/>
+            </w:tcMar>
+          </w:tcPr>
+          <w:p>
+            <w:r>
+              <w:rPr>
+                <w:b w:val="false"/>
+                <w:bCs w:val="false"/>
+                <w:color w:val="1F2937"/>
+                <w:sz w:val="20"/>
+                <w:szCs w:val="20"/>
+              </w:rPr>
+              <w:t xml:space="preserve">Paket aşımı</w:t>
+            </w:r>
+          </w:p>
+        </w:tc>
+        <w:tc>
+          <w:tcPr>
+            <w:tcW w:type="dxa" w:w="4680"/>
+            <w:shd w:fill="FFFFFF" w:val="clear"/>
+            <w:tcMar>
+              <w:top w:type="dxa" w:w="80"/>
+              <w:left w:type="dxa" w:w="120"/>
+              <w:bottom w:type="dxa" w:w="80"/>
+              <w:right w:type="dxa" w:w="120"/>
+            </w:tcMar>
+          </w:tcPr>
+          <w:p>
+            <w:r>
+              <w:rPr>
+                <w:b w:val="false"/>
+                <w:bCs w:val="false"/>
+                <w:color w:val="1F2937"/>
+                <w:sz w:val="20"/>
+                <w:szCs w:val="20"/>
+              </w:rPr>
+              <w:t xml:space="preserve">7,50 ₺ / dakika</w:t>
+            </w:r>
+          </w:p>
+        </w:tc>
+      </w:tr>
+      <w:tr>
+        <w:tc>
+          <w:tcPr>
+            <w:tcW w:type="dxa" w:w="4680"/>
+            <w:shd w:fill="FFFFFF" w:val="clear"/>
+            <w:tcMar>
+              <w:top w:type="dxa" w:w="80"/>
+              <w:left w:type="dxa" w:w="120"/>
+              <w:bottom w:type="dxa" w:w="80"/>
+              <w:right w:type="dxa" w:w="120"/>
+            </w:tcMar>
+          </w:tcPr>
+          <w:p>
+            <w:r>
+              <w:rPr>
+                <w:b w:val="false"/>
+                <w:bCs w:val="false"/>
+                <w:color w:val="1F2937"/>
+                <w:sz w:val="20"/>
+                <w:szCs w:val="20"/>
+              </w:rPr>
+              <w:t xml:space="preserve">Kurulum (tek seferlik)</w:t>
+            </w:r>
+          </w:p>
+        </w:tc>
+        <w:tc>
+          <w:tcPr>
+            <w:tcW w:type="dxa" w:w="4680"/>
+            <w:shd w:fill="FFFFFF" w:val="clear"/>
+            <w:tcMar>
+              <w:top w:type="dxa" w:w="80"/>
+              <w:left w:type="dxa" w:w="120"/>
+              <w:bottom w:type="dxa" w:w="80"/>
+              <w:right w:type="dxa" w:w="120"/>
+            </w:tcMar>
+          </w:tcPr>
+          <w:p>
+            <w:r>
+              <w:rPr>
+                <w:b w:val="false"/>
+                <w:bCs w:val="false"/>
+                <w:color w:val="1F2937"/>
+                <w:sz w:val="20"/>
+                <w:szCs w:val="20"/>
+              </w:rPr>
+              <w:t xml:space="preserve">55.000 ₺</w:t>
+            </w:r>
+          </w:p>
+        </w:tc>
+      </w:tr>
+    </w:tbl>
+    <w:p>
+      <w:pPr>
+        <w:spacing w:after="200"/>
+      </w:pPr>
+    </w:p>
+    <w:p>
+      <w:pPr>
+        <w:spacing w:after="140" w:line="320"/>
+      </w:pPr>
+      <w:r>
+        <w:rPr>
+          <w:i/>
+          <w:iCs/>
+          <w:sz w:val="22"/>
+          <w:szCs w:val="22"/>
+        </w:rPr>
+        <w:t xml:space="preserve">Tüm fiyatlar KDV hariçtir.</w:t>
+      </w:r>
+    </w:p>
+    <w:p>
+      <w:pPr>
+        <w:spacing w:after="140" w:line="320"/>
+      </w:pPr>
+      <w:r>
+        <w:rPr>
+          <w:sz w:val="22"/>
+          <w:szCs w:val="22"/>
+        </w:rPr>
+        <w:t xml:space="preserve">7.500 dakika, günde yaklaşık 100 çağrının her birinin ortalama 2,5 dakika sürmesine karşılık gelir. Gerçek rakamlarınızı ilk ay birlikte ölçecek ve paketi ona göre düzelteceğiz.</w:t>
+      </w:r>
+    </w:p>
+    <w:p>
+      <w:pPr>
+        <w:pStyle w:val="Heading3"/>
+        <w:spacing w:after="120" w:before="280"/>
+      </w:pPr>
+      <w:r>
+        <w:rPr>
+          <w:b/>
+          <w:bCs/>
+          <w:color w:val="134E4A"/>
+          <w:sz w:val="24"/>
+          <w:szCs w:val="24"/>
+        </w:rPr>
+        <w:t xml:space="preserve">Küçük başlamak isterseniz</w:t>
+      </w:r>
+    </w:p>
+    <w:p>
+      <w:pPr>
+        <w:spacing w:after="140" w:line="320"/>
+      </w:pPr>
+      <w:r>
+        <w:rPr>
+          <w:sz w:val="22"/>
+          <w:szCs w:val="22"/>
+        </w:rPr>
+        <w:t xml:space="preserve">7/24'e doğrudan geçmek yerine kademeli ilerlemeyi tercih ederseniz, asistanın yalnızca </w:t>
+      </w:r>
+      <w:r>
+        <w:rPr>
+          <w:b/>
+          <w:bCs/>
+          <w:sz w:val="22"/>
+          <w:szCs w:val="22"/>
+        </w:rPr>
+        <w:t xml:space="preserve">mesai dışı ve hafta sonu</w:t>
+      </w:r>
+      <w:r>
+        <w:rPr>
+          <w:sz w:val="22"/>
+          <w:szCs w:val="22"/>
+        </w:rPr>
+        <w:t xml:space="preserve"> çalıştığı bir başlangıç paketi sunabiliriz. Gündüz çağrılarını resepsiyonunuz karşılamaya devam eder.</w:t>
+      </w:r>
+    </w:p>
+    <w:tbl>
+      <w:tblPr>
+        <w:tblW w:type="dxa" w:w="9360"/>
+        <w:tblBorders>
+          <w:top w:val="single" w:color="auto" w:sz="4"/>
+          <w:left w:val="single" w:color="auto" w:sz="4"/>
+          <w:bottom w:val="single" w:color="auto" w:sz="4"/>
+          <w:right w:val="single" w:color="auto" w:sz="4"/>
+          <w:insideH w:val="single" w:color="auto" w:sz="4"/>
+          <w:insideV w:val="single" w:color="auto" w:sz="4"/>
+        </w:tblBorders>
+      </w:tblPr>
+      <w:tblGrid>
+        <w:gridCol w:w="4680"/>
+        <w:gridCol w:w="4680"/>
+      </w:tblGrid>
+      <w:tr>
+        <w:tc>
+          <w:tcPr>
+            <w:tcW w:type="dxa" w:w="4680"/>
+            <w:shd w:fill="0F766E" w:val="clear"/>
+            <w:tcMar>
+              <w:top w:type="dxa" w:w="80"/>
+              <w:left w:type="dxa" w:w="120"/>
+              <w:bottom w:type="dxa" w:w="80"/>
+              <w:right w:type="dxa" w:w="120"/>
+            </w:tcMar>
+          </w:tcPr>
+          <w:p>
+            <w:r>
+              <w:rPr>
+                <w:b/>
+                <w:bCs/>
+                <w:color w:val="FFFFFF"/>
+                <w:sz w:val="20"/>
+                <w:szCs w:val="20"/>
+              </w:rPr>
+              <w:t xml:space="preserve"/>
+            </w:r>
+          </w:p>
+        </w:tc>
+        <w:tc>
+          <w:tcPr>
+            <w:tcW w:type="dxa" w:w="4680"/>
+            <w:shd w:fill="0F766E" w:val="clear"/>
+            <w:tcMar>
+              <w:top w:type="dxa" w:w="80"/>
+              <w:left w:type="dxa" w:w="120"/>
+              <w:bottom w:type="dxa" w:w="80"/>
+              <w:right w:type="dxa" w:w="120"/>
+            </w:tcMar>
+          </w:tcPr>
+          <w:p>
+            <w:r>
+              <w:rPr>
+                <w:b/>
+                <w:bCs/>
+                <w:color w:val="FFFFFF"/>
+                <w:sz w:val="20"/>
+                <w:szCs w:val="20"/>
+              </w:rPr>
+              <w:t xml:space="preserve"/>
+            </w:r>
+          </w:p>
+        </w:tc>
+      </w:tr>
+      <w:tr>
+        <w:tc>
+          <w:tcPr>
+            <w:tcW w:type="dxa" w:w="4680"/>
+            <w:shd w:fill="FFFFFF" w:val="clear"/>
+            <w:tcMar>
+              <w:top w:type="dxa" w:w="80"/>
+              <w:left w:type="dxa" w:w="120"/>
+              <w:bottom w:type="dxa" w:w="80"/>
+              <w:right w:type="dxa" w:w="120"/>
+            </w:tcMar>
+          </w:tcPr>
+          <w:p>
+            <w:r>
+              <w:rPr>
+                <w:b w:val="false"/>
+                <w:bCs w:val="false"/>
+                <w:color w:val="1F2937"/>
+                <w:sz w:val="20"/>
+                <w:szCs w:val="20"/>
+              </w:rPr>
+              <w:t xml:space="preserve">Aylık ücret</w:t>
+            </w:r>
+          </w:p>
+        </w:tc>
+        <w:tc>
+          <w:tcPr>
+            <w:tcW w:type="dxa" w:w="4680"/>
             <w:shd w:fill="FFFFFF" w:val="clear"/>
             <w:tcMar>
               <w:top w:type="dxa" w:w="80"/>
@@ -499,7 +694,7 @@
       <w:tr>
         <w:tc>
           <w:tcPr>
-            <w:tcW w:type="dxa" w:w="3120"/>
+            <w:tcW w:type="dxa" w:w="4680"/>
             <w:shd w:fill="FFFFFF" w:val="clear"/>
             <w:tcMar>
               <w:top w:type="dxa" w:w="80"/>
@@ -523,31 +718,7 @@
         </w:tc>
         <w:tc>
           <w:tcPr>
-            <w:tcW w:type="dxa" w:w="3120"/>
-            <w:shd w:fill="FFFFFF" w:val="clear"/>
-            <w:tcMar>
-              <w:top w:type="dxa" w:w="80"/>
-              <w:left w:type="dxa" w:w="120"/>
-              <w:bottom w:type="dxa" w:w="80"/>
-              <w:right w:type="dxa" w:w="120"/>
-            </w:tcMar>
-          </w:tcPr>
-          <w:p>
-            <w:r>
-              <w:rPr>
-                <w:b w:val="false"/>
-                <w:bCs w:val="false"/>
-                <w:color w:val="1F2937"/>
-                <w:sz w:val="20"/>
-                <w:szCs w:val="20"/>
-              </w:rPr>
-              <w:t xml:space="preserve">7.500 dakika</w:t>
-            </w:r>
-          </w:p>
-        </w:tc>
-        <w:tc>
-          <w:tcPr>
-            <w:tcW w:type="dxa" w:w="3120"/>
+            <w:tcW w:type="dxa" w:w="4680"/>
             <w:shd w:fill="FFFFFF" w:val="clear"/>
             <w:tcMar>
               <w:top w:type="dxa" w:w="80"/>
@@ -573,7 +744,7 @@
       <w:tr>
         <w:tc>
           <w:tcPr>
-            <w:tcW w:type="dxa" w:w="3120"/>
+            <w:tcW w:type="dxa" w:w="4680"/>
             <w:shd w:fill="FFFFFF" w:val="clear"/>
             <w:tcMar>
               <w:top w:type="dxa" w:w="80"/>
@@ -597,31 +768,7 @@
         </w:tc>
         <w:tc>
           <w:tcPr>
-            <w:tcW w:type="dxa" w:w="3120"/>
-            <w:shd w:fill="FFFFFF" w:val="clear"/>
-            <w:tcMar>
-              <w:top w:type="dxa" w:w="80"/>
-              <w:left w:type="dxa" w:w="120"/>
-              <w:bottom w:type="dxa" w:w="80"/>
-              <w:right w:type="dxa" w:w="120"/>
-            </w:tcMar>
-          </w:tcPr>
-          <w:p>
-            <w:r>
-              <w:rPr>
-                <w:b w:val="false"/>
-                <w:bCs w:val="false"/>
-                <w:color w:val="1F2937"/>
-                <w:sz w:val="20"/>
-                <w:szCs w:val="20"/>
-              </w:rPr>
-              <w:t xml:space="preserve">7,50 ₺ / dakika</w:t>
-            </w:r>
-          </w:p>
-        </w:tc>
-        <w:tc>
-          <w:tcPr>
-            <w:tcW w:type="dxa" w:w="3120"/>
+            <w:tcW w:type="dxa" w:w="4680"/>
             <w:shd w:fill="FFFFFF" w:val="clear"/>
             <w:tcMar>
               <w:top w:type="dxa" w:w="80"/>
@@ -647,7 +794,7 @@
       <w:tr>
         <w:tc>
           <w:tcPr>
-            <w:tcW w:type="dxa" w:w="3120"/>
+            <w:tcW w:type="dxa" w:w="4680"/>
             <w:shd w:fill="FFFFFF" w:val="clear"/>
             <w:tcMar>
               <w:top w:type="dxa" w:w="80"/>
@@ -665,37 +812,13 @@
                 <w:sz w:val="20"/>
                 <w:szCs w:val="20"/>
               </w:rPr>
-              <w:t xml:space="preserve">Kurulum (tek seferlik)</w:t>
+              <w:t xml:space="preserve">Kurulum</w:t>
             </w:r>
           </w:p>
         </w:tc>
         <w:tc>
           <w:tcPr>
-            <w:tcW w:type="dxa" w:w="3120"/>
-            <w:shd w:fill="FFFFFF" w:val="clear"/>
-            <w:tcMar>
-              <w:top w:type="dxa" w:w="80"/>
-              <w:left w:type="dxa" w:w="120"/>
-              <w:bottom w:type="dxa" w:w="80"/>
-              <w:right w:type="dxa" w:w="120"/>
-            </w:tcMar>
-          </w:tcPr>
-          <w:p>
-            <w:r>
-              <w:rPr>
-                <w:b w:val="false"/>
-                <w:bCs w:val="false"/>
-                <w:color w:val="1F2937"/>
-                <w:sz w:val="20"/>
-                <w:szCs w:val="20"/>
-              </w:rPr>
-              <w:t xml:space="preserve">55.000 ₺</w:t>
-            </w:r>
-          </w:p>
-        </w:tc>
-        <w:tc>
-          <w:tcPr>
-            <w:tcW w:type="dxa" w:w="3120"/>
+            <w:tcW w:type="dxa" w:w="4680"/>
             <w:shd w:fill="FFFFFF" w:val="clear"/>
             <w:tcMar>
               <w:top w:type="dxa" w:w="80"/>
@@ -730,12 +853,26 @@
       </w:pPr>
       <w:r>
         <w:rPr>
-          <w:i/>
-          <w:iCs/>
-          <w:sz w:val="22"/>
-          <w:szCs w:val="22"/>
-        </w:rPr>
-        <w:t xml:space="preserve">Tüm fiyatlar KDV hariçtir.</w:t>
+          <w:sz w:val="22"/>
+          <w:szCs w:val="22"/>
+        </w:rPr>
+        <w:t xml:space="preserve">Bu paketten 7/24'e geçiş </w:t>
+      </w:r>
+      <w:r>
+        <w:rPr>
+          <w:b/>
+          <w:bCs/>
+          <w:sz w:val="22"/>
+          <w:szCs w:val="22"/>
+        </w:rPr>
+        <w:t xml:space="preserve">istediğiniz ay yapılabilir</w:t>
+      </w:r>
+      <w:r>
+        <w:rPr>
+          <w:sz w:val="22"/>
+          <w:szCs w:val="22"/>
+        </w:rPr>
+        <w:t xml:space="preserve">, ek kurulum ücreti alınmaz. Teknik olarak aynı sistemdir; yalnızca asistanın çalıştığı saatler değişir.</w:t>
       </w:r>
     </w:p>
     <w:p>
@@ -749,26 +886,14 @@
           <w:sz w:val="22"/>
           <w:szCs w:val="22"/>
         </w:rPr>
-        <w:t xml:space="preserve">Hangisi size uygun:</w:t>
-      </w:r>
-      <w:r>
-        <w:rPr>
-          <w:sz w:val="22"/>
-          <w:szCs w:val="22"/>
-        </w:rPr>
-        <w:t xml:space="preserve"> 7.500 dakika, günde yaklaşık 100 çağrının her birinin ortalama 2,5 dakika sürmesi demek. Mesai dışı seçeneğindeki 2.625 dakika ise bu çağrıların yaklaşık üçte birine karşılık geliyor.</w:t>
-      </w:r>
-    </w:p>
-    <w:p>
-      <w:pPr>
-        <w:spacing w:after="140" w:line="320"/>
-      </w:pPr>
-      <w:r>
-        <w:rPr>
-          <w:sz w:val="22"/>
-          <w:szCs w:val="22"/>
-        </w:rPr>
-        <w:t xml:space="preserve">Gerçek rakamlarınızı ilk ay birlikte ölçeceğiz ve paketi ona göre düzelteceğiz.</w:t>
+        <w:t xml:space="preserve">Önerimiz 7/24'tür.</w:t>
+      </w:r>
+      <w:r>
+        <w:rPr>
+          <w:sz w:val="22"/>
+          <w:szCs w:val="22"/>
+        </w:rPr>
+        <w:t xml:space="preserve"> Sebebi şu: hastaların randevu arayışı akşam ve hafta sonu yoğunlaşıyor, ama asıl fark gündüz ortaya çıkıyor — resepsiyonunuz meşgulken düşen çağrılar da karşılanmış oluyor. Mesai dışı paketi bu kazancı kapsamıyor.</w:t>
       </w:r>
     </w:p>
     <w:p>
@@ -2307,27 +2432,6 @@
           <w:szCs w:val="22"/>
         </w:rPr>
         <w:t xml:space="preserve">Sorularınız için her zaman ulaşabilirsiniz.</w:t>
-      </w:r>
-    </w:p>
-    <w:p>
-      <w:pPr>
-        <w:spacing w:after="140" w:line="320"/>
-      </w:pPr>
-      <w:r>
-        <w:rPr>
-          <w:b/>
-          <w:bCs/>
-          <w:sz w:val="22"/>
-          <w:szCs w:val="22"/>
-        </w:rPr>
-        <w:t xml:space="preserve">MİZ / My İnovatif Zeka</w:t>
-      </w:r>
-      <w:r>
-        <w:rPr>
-          <w:sz w:val="22"/>
-          <w:szCs w:val="22"/>
-        </w:rPr>
-        <w:t xml:space="preserve"> İzmir</w:t>
       </w:r>
     </w:p>
     <w:sectPr>

</xml_diff>